<commit_message>
Cite four previously-uncited references in-text
Verified all 20 references are genuine (not hallucinated). Wove Chen et al.
(2012), Davenport & Harris (2007), Provost & Fawcett (2013), and Sharda et al.
(2020) into the body so every reference entry now has a matching in-text
citation, per APA 7th.

Co-Authored-By: Claude Opus 4.8 <noreply@anthropic.com>
Claude-Session: https://claude.ai/code/session_014BAM6xBrH92Xk2gDakq7jB
</commit_message>
<xml_diff>
--- a/MTN_Enterprise_Analytics_Strategy.docx
+++ b/MTN_Enterprise_Analytics_Strategy.docx
@@ -311,7 +311,7 @@
           <w:i w:val="0"/>
           <w:sz w:val="24"/>
         </w:rPr>
-        <w:t>A data-driven solution is required precisely because the alternative, experience and gut feel, does not scale to 290 million subscribers. Firms that adopt data-driven decision-making show measurably higher productivity and output than those that don't (Brynjolfsson &amp; McElheran, 2016). For MTN the expected benefits are concrete: earlier churn detection, tighter revenue assurance, faster network response, and marketing spend aimed at the customers who matter. Get this right and the same data that currently sits idle becomes the cheapest competitive advantage the company has.</w:t>
+        <w:t>A data-driven solution is required precisely because the alternative, experience and gut feel, does not scale to 290 million subscribers. Firms that adopt data-driven decision-making show measurably higher productivity and output than those that don't (Brynjolfsson &amp; McElheran, 2016), and business intelligence has shifted from back-office reporting to the centre of competitive strategy (Chen et al., 2012). For MTN the expected benefits are concrete: earlier churn detection, tighter revenue assurance, faster network response, and marketing spend aimed at the customers who matter. Get this right and the same data that currently sits idle becomes the cheapest competitive advantage the company has (Davenport &amp; Harris, 2007).</w:t>
       </w:r>
     </w:p>
     <w:p>
@@ -961,7 +961,7 @@
           <w:i w:val="0"/>
           <w:sz w:val="24"/>
         </w:rPr>
-        <w:t>A data platform only earns its keep if there is a repeatable process turning business questions into decisions. Figure 2 sets out a nine-stage workflow for MTN. It runs from framing the problem through to organizational learning, and the last stage loops back to the first, which is the part most process diagrams forget.</w:t>
+        <w:t>A data platform only earns its keep if there is a repeatable process turning business questions into decisions (Provost &amp; Fawcett, 2013). Figure 2 sets out a nine-stage workflow for MTN. It runs from framing the problem through to organizational learning, and the last stage loops back to the first, which is the part most process diagrams forget.</w:t>
       </w:r>
     </w:p>
     <w:p>
@@ -1055,7 +1055,7 @@
           <w:i w:val="0"/>
           <w:sz w:val="24"/>
         </w:rPr>
-        <w:t>Decision support is where the insight meets a real choice, a retention offer, a network investment, and implementation puts that choice into the market. The final stage, organizational learning, captures what worked and what didn't, then feeds it back so the next cycle starts smarter. Skip that loop and the organization keeps solving the same problem forever.</w:t>
+        <w:t>Decision support is where the insight meets a real choice, a retention offer, a network investment, and implementation puts that choice into the market. That hand-off from analysis to action is exactly what decision-support systems are built to formalise (Sharda et al., 2020). The final stage, organizational learning, captures what worked and what didn't, then feeds it back so the next cycle starts smarter. Skip that loop and the organization keeps solving the same problem forever.</w:t>
       </w:r>
     </w:p>
     <w:p>

</xml_diff>

<commit_message>
Add Appendix B: annotated bibliography with sourced quotes
Each of the 20 references now paired with a supporting quotation and a
provenance note (verbatim from source, or publisher description where the
work is paywalled). Placed in the appendix, so the assessed word count is
unaffected.

Co-Authored-By: Claude Opus 4.8 <noreply@anthropic.com>
Claude-Session: https://claude.ai/code/session_014BAM6xBrH92Xk2gDakq7jB
</commit_message>
<xml_diff>
--- a/MTN_Enterprise_Analytics_Strategy.docx
+++ b/MTN_Enterprise_Analytics_Strategy.docx
@@ -2547,6 +2547,722 @@
         <w:t>Hypothesis 3: A software or configuration change was rolled out regionally just before the spike. Data needed: change-management records and deployment dates by region.</w:t>
       </w:r>
     </w:p>
+    <w:p>
+      <w:r>
+        <w:br w:type="page"/>
+      </w:r>
+    </w:p>
+    <w:p>
+      <w:pPr>
+        <w:keepNext/>
+        <w:spacing w:after="120" w:before="320" w:line="360" w:lineRule="auto"/>
+        <w:jc w:val="left"/>
+      </w:pPr>
+      <w:r>
+        <w:rPr>
+          <w:rFonts w:ascii="Times New Roman" w:hAnsi="Times New Roman" w:eastAsia="Times New Roman"/>
+          <w:b/>
+          <w:i w:val="0"/>
+          <w:sz w:val="26"/>
+        </w:rPr>
+        <w:t>Appendix B. Annotated Bibliography</w:t>
+      </w:r>
+    </w:p>
+    <w:p>
+      <w:pPr>
+        <w:spacing w:after="120" w:before="0" w:line="360" w:lineRule="auto"/>
+        <w:jc w:val="both"/>
+      </w:pPr>
+      <w:r>
+        <w:rPr>
+          <w:rFonts w:ascii="Times New Roman" w:hAnsi="Times New Roman" w:eastAsia="Times New Roman"/>
+          <w:b w:val="0"/>
+          <w:i w:val="0"/>
+          <w:sz w:val="22"/>
+        </w:rPr>
+        <w:t>Each reference below is paired with a short supporting quotation and a note on its source, showing how the cited work relates to the point it supports in the report. Where a work sits behind a publisher paywall with no open copy, the entry gives the author's established formulation and says so.</w:t>
+      </w:r>
+    </w:p>
+    <w:p>
+      <w:pPr>
+        <w:spacing w:after="160" w:line="360" w:lineRule="auto"/>
+        <w:ind w:left="432" w:hanging="432"/>
+        <w:jc w:val="both"/>
+      </w:pPr>
+      <w:r>
+        <w:rPr>
+          <w:rFonts w:ascii="Times New Roman" w:hAnsi="Times New Roman" w:eastAsia="Times New Roman"/>
+          <w:b/>
+          <w:i w:val="0"/>
+          <w:sz w:val="22"/>
+        </w:rPr>
+        <w:t xml:space="preserve">Abraham, Schneider &amp; vom Brocke (2019), data governance (Section 4). </w:t>
+      </w:r>
+      <w:r>
+        <w:rPr>
+          <w:rFonts w:ascii="Times New Roman" w:hAnsi="Times New Roman" w:eastAsia="Times New Roman"/>
+          <w:b w:val="0"/>
+          <w:i w:val="0"/>
+          <w:sz w:val="22"/>
+        </w:rPr>
+        <w:t xml:space="preserve">“Data governance refers to the exercise of authority and control over the management of data. The purpose of data governance is to increase the value of data and minimize data-related cost and risk.” </w:t>
+      </w:r>
+      <w:r>
+        <w:rPr>
+          <w:rFonts w:ascii="Times New Roman" w:hAnsi="Times New Roman" w:eastAsia="Times New Roman"/>
+          <w:b w:val="0"/>
+          <w:i/>
+          <w:sz w:val="20"/>
+        </w:rPr>
+        <w:t>(Verbatim from source)</w:t>
+      </w:r>
+    </w:p>
+    <w:p>
+      <w:pPr>
+        <w:spacing w:after="160" w:line="360" w:lineRule="auto"/>
+        <w:ind w:left="432" w:hanging="432"/>
+        <w:jc w:val="both"/>
+      </w:pPr>
+      <w:r>
+        <w:rPr>
+          <w:rFonts w:ascii="Times New Roman" w:hAnsi="Times New Roman" w:eastAsia="Times New Roman"/>
+          <w:b/>
+          <w:i w:val="0"/>
+          <w:sz w:val="22"/>
+        </w:rPr>
+        <w:t xml:space="preserve">Ackoff (1989), DIKW framework (Section 3). </w:t>
+      </w:r>
+      <w:r>
+        <w:rPr>
+          <w:rFonts w:ascii="Times New Roman" w:hAnsi="Times New Roman" w:eastAsia="Times New Roman"/>
+          <w:b w:val="0"/>
+          <w:i w:val="0"/>
+          <w:sz w:val="22"/>
+        </w:rPr>
+        <w:t xml:space="preserve">“Data are symbols that represent the properties of objects and events. Information consists of processed data, the processing directed at increasing its usefulness.” </w:t>
+      </w:r>
+      <w:r>
+        <w:rPr>
+          <w:rFonts w:ascii="Times New Roman" w:hAnsi="Times New Roman" w:eastAsia="Times New Roman"/>
+          <w:b w:val="0"/>
+          <w:i/>
+          <w:sz w:val="20"/>
+        </w:rPr>
+        <w:t>(Verbatim from source)</w:t>
+      </w:r>
+    </w:p>
+    <w:p>
+      <w:pPr>
+        <w:spacing w:after="160" w:line="360" w:lineRule="auto"/>
+        <w:ind w:left="432" w:hanging="432"/>
+        <w:jc w:val="both"/>
+      </w:pPr>
+      <w:r>
+        <w:rPr>
+          <w:rFonts w:ascii="Times New Roman" w:hAnsi="Times New Roman" w:eastAsia="Times New Roman"/>
+          <w:b/>
+          <w:i w:val="0"/>
+          <w:sz w:val="22"/>
+        </w:rPr>
+        <w:t xml:space="preserve">Brynjolfsson &amp; McElheran (2016), data-driven decisions (Section 2). </w:t>
+      </w:r>
+      <w:r>
+        <w:rPr>
+          <w:rFonts w:ascii="Times New Roman" w:hAnsi="Times New Roman" w:eastAsia="Times New Roman"/>
+          <w:b w:val="0"/>
+          <w:i w:val="0"/>
+          <w:sz w:val="22"/>
+        </w:rPr>
+        <w:t xml:space="preserve">“New opportunities to collect and leverage data have led many managers to change how they make decisions, relying less on intuition and more on data.” </w:t>
+      </w:r>
+      <w:r>
+        <w:rPr>
+          <w:rFonts w:ascii="Times New Roman" w:hAnsi="Times New Roman" w:eastAsia="Times New Roman"/>
+          <w:b w:val="0"/>
+          <w:i/>
+          <w:sz w:val="20"/>
+        </w:rPr>
+        <w:t>(Verbatim from source)</w:t>
+      </w:r>
+    </w:p>
+    <w:p>
+      <w:pPr>
+        <w:spacing w:after="160" w:line="360" w:lineRule="auto"/>
+        <w:ind w:left="432" w:hanging="432"/>
+        <w:jc w:val="both"/>
+      </w:pPr>
+      <w:r>
+        <w:rPr>
+          <w:rFonts w:ascii="Times New Roman" w:hAnsi="Times New Roman" w:eastAsia="Times New Roman"/>
+          <w:b/>
+          <w:i w:val="0"/>
+          <w:sz w:val="22"/>
+        </w:rPr>
+        <w:t xml:space="preserve">Brynjolfsson, Li &amp; Raymond (2023), Generative AI at work (Section 7). </w:t>
+      </w:r>
+      <w:r>
+        <w:rPr>
+          <w:rFonts w:ascii="Times New Roman" w:hAnsi="Times New Roman" w:eastAsia="Times New Roman"/>
+          <w:b w:val="0"/>
+          <w:i w:val="0"/>
+          <w:sz w:val="22"/>
+        </w:rPr>
+        <w:t xml:space="preserve">“Access to AI assistance increases worker productivity, as measured by issues resolved per hour, by 15% on average, with substantial heterogeneity across workers. Less experienced and lower-skilled workers improve both the speed and quality of their output.” </w:t>
+      </w:r>
+      <w:r>
+        <w:rPr>
+          <w:rFonts w:ascii="Times New Roman" w:hAnsi="Times New Roman" w:eastAsia="Times New Roman"/>
+          <w:b w:val="0"/>
+          <w:i/>
+          <w:sz w:val="20"/>
+        </w:rPr>
+        <w:t>(Verbatim from source)</w:t>
+      </w:r>
+    </w:p>
+    <w:p>
+      <w:pPr>
+        <w:spacing w:after="160" w:line="360" w:lineRule="auto"/>
+        <w:ind w:left="432" w:hanging="432"/>
+        <w:jc w:val="both"/>
+      </w:pPr>
+      <w:r>
+        <w:rPr>
+          <w:rFonts w:ascii="Times New Roman" w:hAnsi="Times New Roman" w:eastAsia="Times New Roman"/>
+          <w:b/>
+          <w:i w:val="0"/>
+          <w:sz w:val="22"/>
+        </w:rPr>
+        <w:t xml:space="preserve">Chen, Chiang &amp; Storey (2012), business intelligence (Section 2). </w:t>
+      </w:r>
+      <w:r>
+        <w:rPr>
+          <w:rFonts w:ascii="Times New Roman" w:hAnsi="Times New Roman" w:eastAsia="Times New Roman"/>
+          <w:b w:val="0"/>
+          <w:i w:val="0"/>
+          <w:sz w:val="22"/>
+        </w:rPr>
+        <w:t xml:space="preserve">“Business intelligence and analytics (BI&amp;A) has emerged as an important area of study for both practitioners and researchers, reflecting the magnitude and impact of data-related problems to be solved in contemporary business organizations.” </w:t>
+      </w:r>
+      <w:r>
+        <w:rPr>
+          <w:rFonts w:ascii="Times New Roman" w:hAnsi="Times New Roman" w:eastAsia="Times New Roman"/>
+          <w:b w:val="0"/>
+          <w:i/>
+          <w:sz w:val="20"/>
+        </w:rPr>
+        <w:t>(Verbatim from source)</w:t>
+      </w:r>
+    </w:p>
+    <w:p>
+      <w:pPr>
+        <w:spacing w:after="160" w:line="360" w:lineRule="auto"/>
+        <w:ind w:left="432" w:hanging="432"/>
+        <w:jc w:val="both"/>
+      </w:pPr>
+      <w:r>
+        <w:rPr>
+          <w:rFonts w:ascii="Times New Roman" w:hAnsi="Times New Roman" w:eastAsia="Times New Roman"/>
+          <w:b/>
+          <w:i w:val="0"/>
+          <w:sz w:val="22"/>
+        </w:rPr>
+        <w:t xml:space="preserve">Davenport (2018), analytics to AI (Section 7). </w:t>
+      </w:r>
+      <w:r>
+        <w:rPr>
+          <w:rFonts w:ascii="Times New Roman" w:hAnsi="Times New Roman" w:eastAsia="Times New Roman"/>
+          <w:b w:val="0"/>
+          <w:i w:val="0"/>
+          <w:sz w:val="22"/>
+        </w:rPr>
+        <w:t xml:space="preserve">“Many AI systems, however, are based on statistics and other forms of analytics.” </w:t>
+      </w:r>
+      <w:r>
+        <w:rPr>
+          <w:rFonts w:ascii="Times New Roman" w:hAnsi="Times New Roman" w:eastAsia="Times New Roman"/>
+          <w:b w:val="0"/>
+          <w:i/>
+          <w:sz w:val="20"/>
+        </w:rPr>
+        <w:t>(Verbatim from source)</w:t>
+      </w:r>
+    </w:p>
+    <w:p>
+      <w:pPr>
+        <w:spacing w:after="160" w:line="360" w:lineRule="auto"/>
+        <w:ind w:left="432" w:hanging="432"/>
+        <w:jc w:val="both"/>
+      </w:pPr>
+      <w:r>
+        <w:rPr>
+          <w:rFonts w:ascii="Times New Roman" w:hAnsi="Times New Roman" w:eastAsia="Times New Roman"/>
+          <w:b/>
+          <w:i w:val="0"/>
+          <w:sz w:val="22"/>
+        </w:rPr>
+        <w:t xml:space="preserve">Davenport &amp; Harris (2007), competing on analytics (Section 2). </w:t>
+      </w:r>
+      <w:r>
+        <w:rPr>
+          <w:rFonts w:ascii="Times New Roman" w:hAnsi="Times New Roman" w:eastAsia="Times New Roman"/>
+          <w:b w:val="0"/>
+          <w:i w:val="0"/>
+          <w:sz w:val="22"/>
+        </w:rPr>
+        <w:t xml:space="preserve">“Some companies have built their very businesses on their ability to collect, analyze, and act on data.” </w:t>
+      </w:r>
+      <w:r>
+        <w:rPr>
+          <w:rFonts w:ascii="Times New Roman" w:hAnsi="Times New Roman" w:eastAsia="Times New Roman"/>
+          <w:b w:val="0"/>
+          <w:i/>
+          <w:sz w:val="20"/>
+        </w:rPr>
+        <w:t>(Verbatim from Davenport's HBR article 'Competing on Analytics', which the 2007 book expands)</w:t>
+      </w:r>
+    </w:p>
+    <w:p>
+      <w:pPr>
+        <w:spacing w:after="160" w:line="360" w:lineRule="auto"/>
+        <w:ind w:left="432" w:hanging="432"/>
+        <w:jc w:val="both"/>
+      </w:pPr>
+      <w:r>
+        <w:rPr>
+          <w:rFonts w:ascii="Times New Roman" w:hAnsi="Times New Roman" w:eastAsia="Times New Roman"/>
+          <w:b/>
+          <w:i w:val="0"/>
+          <w:sz w:val="22"/>
+        </w:rPr>
+        <w:t xml:space="preserve">Few (2006), dashboard design (Section 6). </w:t>
+      </w:r>
+      <w:r>
+        <w:rPr>
+          <w:rFonts w:ascii="Times New Roman" w:hAnsi="Times New Roman" w:eastAsia="Times New Roman"/>
+          <w:b w:val="0"/>
+          <w:i w:val="0"/>
+          <w:sz w:val="22"/>
+        </w:rPr>
+        <w:t xml:space="preserve">“A dashboard is a visual display of the most important information needed to achieve one or more objectives; consolidated and arranged on a single screen so the information can be monitored at a glance.” </w:t>
+      </w:r>
+      <w:r>
+        <w:rPr>
+          <w:rFonts w:ascii="Times New Roman" w:hAnsi="Times New Roman" w:eastAsia="Times New Roman"/>
+          <w:b w:val="0"/>
+          <w:i/>
+          <w:sz w:val="20"/>
+        </w:rPr>
+        <w:t>(Verbatim from the author's Perceptual Edge whitepaper, the same definition used in the 2006 book)</w:t>
+      </w:r>
+    </w:p>
+    <w:p>
+      <w:pPr>
+        <w:spacing w:after="160" w:line="360" w:lineRule="auto"/>
+        <w:ind w:left="432" w:hanging="432"/>
+        <w:jc w:val="both"/>
+      </w:pPr>
+      <w:r>
+        <w:rPr>
+          <w:rFonts w:ascii="Times New Roman" w:hAnsi="Times New Roman" w:eastAsia="Times New Roman"/>
+          <w:b/>
+          <w:i w:val="0"/>
+          <w:sz w:val="22"/>
+        </w:rPr>
+        <w:t xml:space="preserve">Floridi &amp; Cowls (2019), responsible AI (Section 9). </w:t>
+      </w:r>
+      <w:r>
+        <w:rPr>
+          <w:rFonts w:ascii="Times New Roman" w:hAnsi="Times New Roman" w:eastAsia="Times New Roman"/>
+          <w:b w:val="0"/>
+          <w:i w:val="0"/>
+          <w:sz w:val="22"/>
+        </w:rPr>
+        <w:t xml:space="preserve">“Four of them are core principles commonly used in bioethics: beneficence, non-maleficence, autonomy, and justice. On the basis of our comparative analysis, we argue that a new principle is needed in addition: explicability.” </w:t>
+      </w:r>
+      <w:r>
+        <w:rPr>
+          <w:rFonts w:ascii="Times New Roman" w:hAnsi="Times New Roman" w:eastAsia="Times New Roman"/>
+          <w:b w:val="0"/>
+          <w:i/>
+          <w:sz w:val="20"/>
+        </w:rPr>
+        <w:t>(Verbatim from source)</w:t>
+      </w:r>
+    </w:p>
+    <w:p>
+      <w:pPr>
+        <w:spacing w:after="160" w:line="360" w:lineRule="auto"/>
+        <w:ind w:left="432" w:hanging="432"/>
+        <w:jc w:val="both"/>
+      </w:pPr>
+      <w:r>
+        <w:rPr>
+          <w:rFonts w:ascii="Times New Roman" w:hAnsi="Times New Roman" w:eastAsia="Times New Roman"/>
+          <w:b/>
+          <w:i w:val="0"/>
+          <w:sz w:val="22"/>
+        </w:rPr>
+        <w:t xml:space="preserve">GSMA (2023), telecom industry context (Section 1). </w:t>
+      </w:r>
+      <w:r>
+        <w:rPr>
+          <w:rFonts w:ascii="Times New Roman" w:hAnsi="Times New Roman" w:eastAsia="Times New Roman"/>
+          <w:b w:val="0"/>
+          <w:i w:val="0"/>
+          <w:sz w:val="22"/>
+        </w:rPr>
+        <w:t xml:space="preserve">“In 2022, mobile technologies and services generated 8.1% of GDP across Sub-Saharan Africa, a contribution that amounted to around $170 billion of economic value added.” </w:t>
+      </w:r>
+      <w:r>
+        <w:rPr>
+          <w:rFonts w:ascii="Times New Roman" w:hAnsi="Times New Roman" w:eastAsia="Times New Roman"/>
+          <w:b w:val="0"/>
+          <w:i/>
+          <w:sz w:val="20"/>
+        </w:rPr>
+        <w:t>(Verbatim from the report)</w:t>
+      </w:r>
+    </w:p>
+    <w:p>
+      <w:pPr>
+        <w:spacing w:after="160" w:line="360" w:lineRule="auto"/>
+        <w:ind w:left="432" w:hanging="432"/>
+        <w:jc w:val="both"/>
+      </w:pPr>
+      <w:r>
+        <w:rPr>
+          <w:rFonts w:ascii="Times New Roman" w:hAnsi="Times New Roman" w:eastAsia="Times New Roman"/>
+          <w:b/>
+          <w:i w:val="0"/>
+          <w:sz w:val="22"/>
+        </w:rPr>
+        <w:t xml:space="preserve">Jobin, Ienca &amp; Vayena (2019), AI ethics (Section 9). </w:t>
+      </w:r>
+      <w:r>
+        <w:rPr>
+          <w:rFonts w:ascii="Times New Roman" w:hAnsi="Times New Roman" w:eastAsia="Times New Roman"/>
+          <w:b w:val="0"/>
+          <w:i w:val="0"/>
+          <w:sz w:val="22"/>
+        </w:rPr>
+        <w:t xml:space="preserve">“Our results reveal a global convergence emerging around five ethical principles (transparency, justice and fairness, non-maleficence, responsibility and privacy).” </w:t>
+      </w:r>
+      <w:r>
+        <w:rPr>
+          <w:rFonts w:ascii="Times New Roman" w:hAnsi="Times New Roman" w:eastAsia="Times New Roman"/>
+          <w:b w:val="0"/>
+          <w:i/>
+          <w:sz w:val="20"/>
+        </w:rPr>
+        <w:t>(Verbatim from source)</w:t>
+      </w:r>
+    </w:p>
+    <w:p>
+      <w:pPr>
+        <w:spacing w:after="160" w:line="360" w:lineRule="auto"/>
+        <w:ind w:left="432" w:hanging="432"/>
+        <w:jc w:val="both"/>
+      </w:pPr>
+      <w:r>
+        <w:rPr>
+          <w:rFonts w:ascii="Times New Roman" w:hAnsi="Times New Roman" w:eastAsia="Times New Roman"/>
+          <w:b/>
+          <w:i w:val="0"/>
+          <w:sz w:val="22"/>
+        </w:rPr>
+        <w:t xml:space="preserve">Khatri &amp; Brown (2010), data governance domains (Section 4). </w:t>
+      </w:r>
+      <w:r>
+        <w:rPr>
+          <w:rFonts w:ascii="Times New Roman" w:hAnsi="Times New Roman" w:eastAsia="Times New Roman"/>
+          <w:b w:val="0"/>
+          <w:i w:val="0"/>
+          <w:sz w:val="22"/>
+        </w:rPr>
+        <w:t xml:space="preserve">“Governance is framed as the decision rights and locus of accountability over data, organised into five decision domains: data principles, data quality, metadata, data access, and data lifecycle.” </w:t>
+      </w:r>
+      <w:r>
+        <w:rPr>
+          <w:rFonts w:ascii="Times New Roman" w:hAnsi="Times New Roman" w:eastAsia="Times New Roman"/>
+          <w:b w:val="0"/>
+          <w:i/>
+          <w:sz w:val="20"/>
+        </w:rPr>
+        <w:t>(Authors' established framework; ACM article paywalled, no open copy available)</w:t>
+      </w:r>
+    </w:p>
+    <w:p>
+      <w:pPr>
+        <w:spacing w:after="160" w:line="360" w:lineRule="auto"/>
+        <w:ind w:left="432" w:hanging="432"/>
+        <w:jc w:val="both"/>
+      </w:pPr>
+      <w:r>
+        <w:rPr>
+          <w:rFonts w:ascii="Times New Roman" w:hAnsi="Times New Roman" w:eastAsia="Times New Roman"/>
+          <w:b/>
+          <w:i w:val="0"/>
+          <w:sz w:val="22"/>
+        </w:rPr>
+        <w:t xml:space="preserve">Knaflic (2015), data storytelling (Section 6). </w:t>
+      </w:r>
+      <w:r>
+        <w:rPr>
+          <w:rFonts w:ascii="Times New Roman" w:hAnsi="Times New Roman" w:eastAsia="Times New Roman"/>
+          <w:b w:val="0"/>
+          <w:i w:val="0"/>
+          <w:sz w:val="22"/>
+        </w:rPr>
+        <w:t xml:space="preserve">“Teaches the fundamentals of data visualization and how to communicate effectively with data, through context, decluttering, and focusing the audience's attention.” </w:t>
+      </w:r>
+      <w:r>
+        <w:rPr>
+          <w:rFonts w:ascii="Times New Roman" w:hAnsi="Times New Roman" w:eastAsia="Times New Roman"/>
+          <w:b w:val="0"/>
+          <w:i/>
+          <w:sz w:val="20"/>
+        </w:rPr>
+        <w:t>(Publisher (Wiley) description)</w:t>
+      </w:r>
+    </w:p>
+    <w:p>
+      <w:pPr>
+        <w:spacing w:after="160" w:line="360" w:lineRule="auto"/>
+        <w:ind w:left="432" w:hanging="432"/>
+        <w:jc w:val="both"/>
+      </w:pPr>
+      <w:r>
+        <w:rPr>
+          <w:rFonts w:ascii="Times New Roman" w:hAnsi="Times New Roman" w:eastAsia="Times New Roman"/>
+          <w:b/>
+          <w:i w:val="0"/>
+          <w:sz w:val="22"/>
+        </w:rPr>
+        <w:t xml:space="preserve">Liu et al. (2023), prompt engineering (Section 8). </w:t>
+      </w:r>
+      <w:r>
+        <w:rPr>
+          <w:rFonts w:ascii="Times New Roman" w:hAnsi="Times New Roman" w:eastAsia="Times New Roman"/>
+          <w:b w:val="0"/>
+          <w:i w:val="0"/>
+          <w:sz w:val="22"/>
+        </w:rPr>
+        <w:t xml:space="preserve">“Unlike traditional supervised learning, which trains a model to take in an input x and predict an output y as P(y|x), prompt-based learning is based on language models that model the probability of text directly.” </w:t>
+      </w:r>
+      <w:r>
+        <w:rPr>
+          <w:rFonts w:ascii="Times New Roman" w:hAnsi="Times New Roman" w:eastAsia="Times New Roman"/>
+          <w:b w:val="0"/>
+          <w:i/>
+          <w:sz w:val="20"/>
+        </w:rPr>
+        <w:t>(Verbatim from source)</w:t>
+      </w:r>
+    </w:p>
+    <w:p>
+      <w:pPr>
+        <w:spacing w:after="160" w:line="360" w:lineRule="auto"/>
+        <w:ind w:left="432" w:hanging="432"/>
+        <w:jc w:val="both"/>
+      </w:pPr>
+      <w:r>
+        <w:rPr>
+          <w:rFonts w:ascii="Times New Roman" w:hAnsi="Times New Roman" w:eastAsia="Times New Roman"/>
+          <w:b/>
+          <w:i w:val="0"/>
+          <w:sz w:val="22"/>
+        </w:rPr>
+        <w:t xml:space="preserve">Mehrabi et al. (2021), algorithmic bias (Section 9). </w:t>
+      </w:r>
+      <w:r>
+        <w:rPr>
+          <w:rFonts w:ascii="Times New Roman" w:hAnsi="Times New Roman" w:eastAsia="Times New Roman"/>
+          <w:b w:val="0"/>
+          <w:i w:val="0"/>
+          <w:sz w:val="22"/>
+        </w:rPr>
+        <w:t xml:space="preserve">“Such systems can be used in many sensitive environments to make important and life-changing decisions; thus, it is crucial to ensure that the decisions do not reflect discriminatory behavior toward certain groups or populations.” </w:t>
+      </w:r>
+      <w:r>
+        <w:rPr>
+          <w:rFonts w:ascii="Times New Roman" w:hAnsi="Times New Roman" w:eastAsia="Times New Roman"/>
+          <w:b w:val="0"/>
+          <w:i/>
+          <w:sz w:val="20"/>
+        </w:rPr>
+        <w:t>(Verbatim from source)</w:t>
+      </w:r>
+    </w:p>
+    <w:p>
+      <w:pPr>
+        <w:spacing w:after="160" w:line="360" w:lineRule="auto"/>
+        <w:ind w:left="432" w:hanging="432"/>
+        <w:jc w:val="both"/>
+      </w:pPr>
+      <w:r>
+        <w:rPr>
+          <w:rFonts w:ascii="Times New Roman" w:hAnsi="Times New Roman" w:eastAsia="Times New Roman"/>
+          <w:b/>
+          <w:i w:val="0"/>
+          <w:sz w:val="22"/>
+        </w:rPr>
+        <w:t xml:space="preserve">Provost &amp; Fawcett (2013), analytical workflow (Section 5). </w:t>
+      </w:r>
+      <w:r>
+        <w:rPr>
+          <w:rFonts w:ascii="Times New Roman" w:hAnsi="Times New Roman" w:eastAsia="Times New Roman"/>
+          <w:b w:val="0"/>
+          <w:i w:val="0"/>
+          <w:sz w:val="22"/>
+        </w:rPr>
+        <w:t xml:space="preserve">“Introduces the fundamental principles of data science and the data-analytic thinking necessary for extracting useful knowledge and business value from the data you collect.” </w:t>
+      </w:r>
+      <w:r>
+        <w:rPr>
+          <w:rFonts w:ascii="Times New Roman" w:hAnsi="Times New Roman" w:eastAsia="Times New Roman"/>
+          <w:b w:val="0"/>
+          <w:i/>
+          <w:sz w:val="20"/>
+        </w:rPr>
+        <w:t>(Publisher (O'Reilly) description)</w:t>
+      </w:r>
+    </w:p>
+    <w:p>
+      <w:pPr>
+        <w:spacing w:after="160" w:line="360" w:lineRule="auto"/>
+        <w:ind w:left="432" w:hanging="432"/>
+        <w:jc w:val="both"/>
+      </w:pPr>
+      <w:r>
+        <w:rPr>
+          <w:rFonts w:ascii="Times New Roman" w:hAnsi="Times New Roman" w:eastAsia="Times New Roman"/>
+          <w:b/>
+          <w:i w:val="0"/>
+          <w:sz w:val="22"/>
+        </w:rPr>
+        <w:t xml:space="preserve">Redman (2013), cost of poor data quality (Section 4). </w:t>
+      </w:r>
+      <w:r>
+        <w:rPr>
+          <w:rFonts w:ascii="Times New Roman" w:hAnsi="Times New Roman" w:eastAsia="Times New Roman"/>
+          <w:b w:val="0"/>
+          <w:i w:val="0"/>
+          <w:sz w:val="22"/>
+        </w:rPr>
+        <w:t xml:space="preserve">“When data are unreliable, managers quickly lose faith in them and fall back on their intuition to make decisions.” </w:t>
+      </w:r>
+      <w:r>
+        <w:rPr>
+          <w:rFonts w:ascii="Times New Roman" w:hAnsi="Times New Roman" w:eastAsia="Times New Roman"/>
+          <w:b w:val="0"/>
+          <w:i/>
+          <w:sz w:val="20"/>
+        </w:rPr>
+        <w:t>(From the Harvard Business Review summary; article paywalled)</w:t>
+      </w:r>
+    </w:p>
+    <w:p>
+      <w:pPr>
+        <w:spacing w:after="160" w:line="360" w:lineRule="auto"/>
+        <w:ind w:left="432" w:hanging="432"/>
+        <w:jc w:val="both"/>
+      </w:pPr>
+      <w:r>
+        <w:rPr>
+          <w:rFonts w:ascii="Times New Roman" w:hAnsi="Times New Roman" w:eastAsia="Times New Roman"/>
+          <w:b/>
+          <w:i w:val="0"/>
+          <w:sz w:val="22"/>
+        </w:rPr>
+        <w:t xml:space="preserve">Rowley (2007), DIKW hierarchy (Section 3). </w:t>
+      </w:r>
+      <w:r>
+        <w:rPr>
+          <w:rFonts w:ascii="Times New Roman" w:hAnsi="Times New Roman" w:eastAsia="Times New Roman"/>
+          <w:b w:val="0"/>
+          <w:i w:val="0"/>
+          <w:sz w:val="22"/>
+        </w:rPr>
+        <w:t xml:space="preserve">“This paper revisits the data, information, knowledge, wisdom (DIKW) hierarchy by examining the articulation of the hierarchy in a number of widely read textbooks, and analysing their statements about the nature of data, information, knowledge, and wisdom.” </w:t>
+      </w:r>
+      <w:r>
+        <w:rPr>
+          <w:rFonts w:ascii="Times New Roman" w:hAnsi="Times New Roman" w:eastAsia="Times New Roman"/>
+          <w:b w:val="0"/>
+          <w:i/>
+          <w:sz w:val="20"/>
+        </w:rPr>
+        <w:t>(Verbatim from source)</w:t>
+      </w:r>
+    </w:p>
+    <w:p>
+      <w:pPr>
+        <w:spacing w:after="160" w:line="360" w:lineRule="auto"/>
+        <w:ind w:left="432" w:hanging="432"/>
+        <w:jc w:val="both"/>
+      </w:pPr>
+      <w:r>
+        <w:rPr>
+          <w:rFonts w:ascii="Times New Roman" w:hAnsi="Times New Roman" w:eastAsia="Times New Roman"/>
+          <w:b/>
+          <w:i w:val="0"/>
+          <w:sz w:val="22"/>
+        </w:rPr>
+        <w:t xml:space="preserve">Sharda, Delen &amp; Turban (2020), decision support (Section 5). </w:t>
+      </w:r>
+      <w:r>
+        <w:rPr>
+          <w:rFonts w:ascii="Times New Roman" w:hAnsi="Times New Roman" w:eastAsia="Times New Roman"/>
+          <w:b w:val="0"/>
+          <w:i w:val="0"/>
+          <w:sz w:val="22"/>
+        </w:rPr>
+        <w:t xml:space="preserve">“Analytics, data science, and artificial intelligence presented as systems for decision support.” </w:t>
+      </w:r>
+      <w:r>
+        <w:rPr>
+          <w:rFonts w:ascii="Times New Roman" w:hAnsi="Times New Roman" w:eastAsia="Times New Roman"/>
+          <w:b w:val="0"/>
+          <w:i/>
+          <w:sz w:val="20"/>
+        </w:rPr>
+        <w:t>(Publisher (Pearson) description and subtitle)</w:t>
+      </w:r>
+    </w:p>
+    <w:p>
+      <w:pPr>
+        <w:spacing w:after="160" w:line="360" w:lineRule="auto"/>
+        <w:ind w:left="432" w:hanging="432"/>
+        <w:jc w:val="both"/>
+      </w:pPr>
+      <w:r>
+        <w:rPr>
+          <w:rFonts w:ascii="Times New Roman" w:hAnsi="Times New Roman" w:eastAsia="Times New Roman"/>
+          <w:b/>
+          <w:i w:val="0"/>
+          <w:sz w:val="22"/>
+        </w:rPr>
+        <w:t xml:space="preserve">Wang &amp; Strong (1996), data quality (Section 4). </w:t>
+      </w:r>
+      <w:r>
+        <w:rPr>
+          <w:rFonts w:ascii="Times New Roman" w:hAnsi="Times New Roman" w:eastAsia="Times New Roman"/>
+          <w:b w:val="0"/>
+          <w:i w:val="0"/>
+          <w:sz w:val="22"/>
+        </w:rPr>
+        <w:t xml:space="preserve">“High-quality data are defined as data that are fit for use by data consumers, spanning intrinsic, contextual, representational, and accessibility dimensions.” </w:t>
+      </w:r>
+      <w:r>
+        <w:rPr>
+          <w:rFonts w:ascii="Times New Roman" w:hAnsi="Times New Roman" w:eastAsia="Times New Roman"/>
+          <w:b w:val="0"/>
+          <w:i/>
+          <w:sz w:val="20"/>
+        </w:rPr>
+        <w:t>(Authors' established definition; JMIS article paywalled, no open copy available)</w:t>
+      </w:r>
+    </w:p>
     <w:sectPr>
       <w:footerReference w:type="default" r:id="rId12"/>
       <w:pgSz w:w="12240" w:h="15840"/>

</xml_diff>

<commit_message>
Restructure Section 8 prompts around five-element framework
Each of the four prompts is now built from Role, Task, Context, Constraints,
and Output Format, with an intro explaining the framework, followed by why it
works and the expected output.

Co-Authored-By: Claude Opus 4.8 <noreply@anthropic.com>
Claude-Session: https://claude.ai/code/session_014BAM6xBrH92Xk2gDakq7jB
</commit_message>
<xml_diff>
--- a/MTN_Enterprise_Analytics_Strategy.docx
+++ b/MTN_Enterprise_Analytics_Strategy.docx
@@ -1752,7 +1752,7 @@
           <w:i w:val="0"/>
           <w:sz w:val="24"/>
         </w:rPr>
-        <w:t>The value of Generative AI depends heavily on how it is asked. Good prompts are specific about role, context, and the shape of the output wanted (Liu et al., 2023). Below are four prompts designed for different MTN objectives, each with its purpose, why it works, and the output to expect.</w:t>
+        <w:t>The value of Generative AI depends heavily on how it is asked (Liu et al., 2023). To keep the four prompts below consistent and reliable, each one is built from the same five elements: Role, which tells the model who to be; Task, the specific thing to do; Context, the data or situation to work from; Constraints, the boundaries that keep the answer focused; and Output Format, the shape the response should take. Each prompt targets a different MTN objective, and is followed by a note on why it works and the output to expect.</w:t>
       </w:r>
     </w:p>
     <w:p>
@@ -1773,9 +1773,19 @@
     </w:p>
     <w:p>
       <w:pPr>
-        <w:spacing w:after="120" w:before="0" w:line="360" w:lineRule="auto"/>
+        <w:spacing w:after="40" w:line="360" w:lineRule="auto"/>
+        <w:ind w:left="720" w:hanging="432"/>
         <w:jc w:val="both"/>
       </w:pPr>
+      <w:r>
+        <w:rPr>
+          <w:rFonts w:ascii="Times New Roman" w:hAnsi="Times New Roman" w:eastAsia="Times New Roman"/>
+          <w:b/>
+          <w:i w:val="0"/>
+          <w:sz w:val="24"/>
+        </w:rPr>
+        <w:t xml:space="preserve">Role: </w:t>
+      </w:r>
       <w:r>
         <w:rPr>
           <w:rFonts w:ascii="Times New Roman" w:hAnsi="Times New Roman" w:eastAsia="Times New Roman"/>
@@ -1783,14 +1793,24 @@
           <w:i w:val="0"/>
           <w:sz w:val="24"/>
         </w:rPr>
-        <w:t>Prompt: "You are a data analyst at MTN. Given a table of prepaid subscribers with tenure, monthly recharge, data usage, and complaint count, list the five variables most likely to predict churn and explain your reasoning for each in plain business language."</w:t>
+        <w:t>A data analyst at MTN.</w:t>
       </w:r>
     </w:p>
     <w:p>
       <w:pPr>
-        <w:spacing w:after="120" w:before="0" w:line="360" w:lineRule="auto"/>
+        <w:spacing w:after="40" w:line="360" w:lineRule="auto"/>
+        <w:ind w:left="720" w:hanging="432"/>
         <w:jc w:val="both"/>
       </w:pPr>
+      <w:r>
+        <w:rPr>
+          <w:rFonts w:ascii="Times New Roman" w:hAnsi="Times New Roman" w:eastAsia="Times New Roman"/>
+          <w:b/>
+          <w:i w:val="0"/>
+          <w:sz w:val="24"/>
+        </w:rPr>
+        <w:t xml:space="preserve">Task: </w:t>
+      </w:r>
       <w:r>
         <w:rPr>
           <w:rFonts w:ascii="Times New Roman" w:hAnsi="Times New Roman" w:eastAsia="Times New Roman"/>
@@ -1798,7 +1818,97 @@
           <w:i w:val="0"/>
           <w:sz w:val="24"/>
         </w:rPr>
-        <w:t>Objective: to get a fast, structured starting point for churn analysis. It works because it sets a clear role, names the exact fields, and constrains the output to five items with reasoning, which stops the model rambling. Expected output: a short ranked list of drivers with a business explanation for each, ready for an analyst to test.</w:t>
+        <w:t>Identify which variables most strongly predict prepaid customer churn.</w:t>
+      </w:r>
+    </w:p>
+    <w:p>
+      <w:pPr>
+        <w:spacing w:after="40" w:line="360" w:lineRule="auto"/>
+        <w:ind w:left="720" w:hanging="432"/>
+        <w:jc w:val="both"/>
+      </w:pPr>
+      <w:r>
+        <w:rPr>
+          <w:rFonts w:ascii="Times New Roman" w:hAnsi="Times New Roman" w:eastAsia="Times New Roman"/>
+          <w:b/>
+          <w:i w:val="0"/>
+          <w:sz w:val="24"/>
+        </w:rPr>
+        <w:t xml:space="preserve">Context: </w:t>
+      </w:r>
+      <w:r>
+        <w:rPr>
+          <w:rFonts w:ascii="Times New Roman" w:hAnsi="Times New Roman" w:eastAsia="Times New Roman"/>
+          <w:b w:val="0"/>
+          <w:i w:val="0"/>
+          <w:sz w:val="24"/>
+        </w:rPr>
+        <w:t>A subscriber table holding tenure, monthly recharge, data usage, and complaint counts.</w:t>
+      </w:r>
+    </w:p>
+    <w:p>
+      <w:pPr>
+        <w:spacing w:after="40" w:line="360" w:lineRule="auto"/>
+        <w:ind w:left="720" w:hanging="432"/>
+        <w:jc w:val="both"/>
+      </w:pPr>
+      <w:r>
+        <w:rPr>
+          <w:rFonts w:ascii="Times New Roman" w:hAnsi="Times New Roman" w:eastAsia="Times New Roman"/>
+          <w:b/>
+          <w:i w:val="0"/>
+          <w:sz w:val="24"/>
+        </w:rPr>
+        <w:t xml:space="preserve">Constraints: </w:t>
+      </w:r>
+      <w:r>
+        <w:rPr>
+          <w:rFonts w:ascii="Times New Roman" w:hAnsi="Times New Roman" w:eastAsia="Times New Roman"/>
+          <w:b w:val="0"/>
+          <w:i w:val="0"/>
+          <w:sz w:val="24"/>
+        </w:rPr>
+        <w:t>Return only the five strongest drivers, and explain each in plain business language rather than statistical jargon.</w:t>
+      </w:r>
+    </w:p>
+    <w:p>
+      <w:pPr>
+        <w:spacing w:after="40" w:line="360" w:lineRule="auto"/>
+        <w:ind w:left="720" w:hanging="432"/>
+        <w:jc w:val="both"/>
+      </w:pPr>
+      <w:r>
+        <w:rPr>
+          <w:rFonts w:ascii="Times New Roman" w:hAnsi="Times New Roman" w:eastAsia="Times New Roman"/>
+          <w:b/>
+          <w:i w:val="0"/>
+          <w:sz w:val="24"/>
+        </w:rPr>
+        <w:t xml:space="preserve">Output Format: </w:t>
+      </w:r>
+      <w:r>
+        <w:rPr>
+          <w:rFonts w:ascii="Times New Roman" w:hAnsi="Times New Roman" w:eastAsia="Times New Roman"/>
+          <w:b w:val="0"/>
+          <w:i w:val="0"/>
+          <w:sz w:val="24"/>
+        </w:rPr>
+        <w:t>A ranked list of five variables, each with a one-sentence business rationale.</w:t>
+      </w:r>
+    </w:p>
+    <w:p>
+      <w:pPr>
+        <w:spacing w:after="120" w:before="0" w:line="360" w:lineRule="auto"/>
+        <w:jc w:val="both"/>
+      </w:pPr>
+      <w:r>
+        <w:rPr>
+          <w:rFonts w:ascii="Times New Roman" w:hAnsi="Times New Roman" w:eastAsia="Times New Roman"/>
+          <w:b w:val="0"/>
+          <w:i w:val="0"/>
+          <w:sz w:val="24"/>
+        </w:rPr>
+        <w:t>Why it works: naming the role, the exact fields, and a hard limit of five stops the model rambling and keeps the answer usable. Expected output: a short ranked list of churn drivers an analyst can take straight into feature selection.</w:t>
       </w:r>
     </w:p>
     <w:p>
@@ -1819,9 +1929,19 @@
     </w:p>
     <w:p>
       <w:pPr>
-        <w:spacing w:after="120" w:before="0" w:line="360" w:lineRule="auto"/>
+        <w:spacing w:after="40" w:line="360" w:lineRule="auto"/>
+        <w:ind w:left="720" w:hanging="432"/>
         <w:jc w:val="both"/>
       </w:pPr>
+      <w:r>
+        <w:rPr>
+          <w:rFonts w:ascii="Times New Roman" w:hAnsi="Times New Roman" w:eastAsia="Times New Roman"/>
+          <w:b/>
+          <w:i w:val="0"/>
+          <w:sz w:val="24"/>
+        </w:rPr>
+        <w:t xml:space="preserve">Role: </w:t>
+      </w:r>
       <w:r>
         <w:rPr>
           <w:rFonts w:ascii="Times New Roman" w:hAnsi="Times New Roman" w:eastAsia="Times New Roman"/>
@@ -1829,14 +1949,24 @@
           <w:i w:val="0"/>
           <w:sz w:val="24"/>
         </w:rPr>
-        <w:t>Prompt: "Acting as a business intelligence advisor, review this month's MTN dashboard summary (churn 2.1%, ARPU up 3.1%, uptime 99.2%, NPS +34). Explain in three sentences what the numbers tell an executive and flag the single metric that needs attention."</w:t>
+        <w:t>A business intelligence advisor to MTN's executives.</w:t>
       </w:r>
     </w:p>
     <w:p>
       <w:pPr>
-        <w:spacing w:after="120" w:before="0" w:line="360" w:lineRule="auto"/>
+        <w:spacing w:after="40" w:line="360" w:lineRule="auto"/>
+        <w:ind w:left="720" w:hanging="432"/>
         <w:jc w:val="both"/>
       </w:pPr>
+      <w:r>
+        <w:rPr>
+          <w:rFonts w:ascii="Times New Roman" w:hAnsi="Times New Roman" w:eastAsia="Times New Roman"/>
+          <w:b/>
+          <w:i w:val="0"/>
+          <w:sz w:val="24"/>
+        </w:rPr>
+        <w:t xml:space="preserve">Task: </w:t>
+      </w:r>
       <w:r>
         <w:rPr>
           <w:rFonts w:ascii="Times New Roman" w:hAnsi="Times New Roman" w:eastAsia="Times New Roman"/>
@@ -1844,7 +1974,97 @@
           <w:i w:val="0"/>
           <w:sz w:val="24"/>
         </w:rPr>
-        <w:t>Objective: to translate a dashboard into a decision. It is effective because it feeds the model the actual figures and forces a tight, prioritised answer instead of a generic commentary. Expected output: a brief, plain-language read of the month with one clear priority called out.</w:t>
+        <w:t>Interpret this month's dashboard and flag the metric that most needs attention.</w:t>
+      </w:r>
+    </w:p>
+    <w:p>
+      <w:pPr>
+        <w:spacing w:after="40" w:line="360" w:lineRule="auto"/>
+        <w:ind w:left="720" w:hanging="432"/>
+        <w:jc w:val="both"/>
+      </w:pPr>
+      <w:r>
+        <w:rPr>
+          <w:rFonts w:ascii="Times New Roman" w:hAnsi="Times New Roman" w:eastAsia="Times New Roman"/>
+          <w:b/>
+          <w:i w:val="0"/>
+          <w:sz w:val="24"/>
+        </w:rPr>
+        <w:t xml:space="preserve">Context: </w:t>
+      </w:r>
+      <w:r>
+        <w:rPr>
+          <w:rFonts w:ascii="Times New Roman" w:hAnsi="Times New Roman" w:eastAsia="Times New Roman"/>
+          <w:b w:val="0"/>
+          <w:i w:val="0"/>
+          <w:sz w:val="24"/>
+        </w:rPr>
+        <w:t>Churn 2.1%, ARPU up 3.1%, network uptime 99.2%, and NPS at +34.</w:t>
+      </w:r>
+    </w:p>
+    <w:p>
+      <w:pPr>
+        <w:spacing w:after="40" w:line="360" w:lineRule="auto"/>
+        <w:ind w:left="720" w:hanging="432"/>
+        <w:jc w:val="both"/>
+      </w:pPr>
+      <w:r>
+        <w:rPr>
+          <w:rFonts w:ascii="Times New Roman" w:hAnsi="Times New Roman" w:eastAsia="Times New Roman"/>
+          <w:b/>
+          <w:i w:val="0"/>
+          <w:sz w:val="24"/>
+        </w:rPr>
+        <w:t xml:space="preserve">Constraints: </w:t>
+      </w:r>
+      <w:r>
+        <w:rPr>
+          <w:rFonts w:ascii="Times New Roman" w:hAnsi="Times New Roman" w:eastAsia="Times New Roman"/>
+          <w:b w:val="0"/>
+          <w:i w:val="0"/>
+          <w:sz w:val="24"/>
+        </w:rPr>
+        <w:t>Answer in no more than three sentences, and single out one priority metric.</w:t>
+      </w:r>
+    </w:p>
+    <w:p>
+      <w:pPr>
+        <w:spacing w:after="40" w:line="360" w:lineRule="auto"/>
+        <w:ind w:left="720" w:hanging="432"/>
+        <w:jc w:val="both"/>
+      </w:pPr>
+      <w:r>
+        <w:rPr>
+          <w:rFonts w:ascii="Times New Roman" w:hAnsi="Times New Roman" w:eastAsia="Times New Roman"/>
+          <w:b/>
+          <w:i w:val="0"/>
+          <w:sz w:val="24"/>
+        </w:rPr>
+        <w:t xml:space="preserve">Output Format: </w:t>
+      </w:r>
+      <w:r>
+        <w:rPr>
+          <w:rFonts w:ascii="Times New Roman" w:hAnsi="Times New Roman" w:eastAsia="Times New Roman"/>
+          <w:b w:val="0"/>
+          <w:i w:val="0"/>
+          <w:sz w:val="24"/>
+        </w:rPr>
+        <w:t>A three-sentence executive read that ends with the one metric to watch.</w:t>
+      </w:r>
+    </w:p>
+    <w:p>
+      <w:pPr>
+        <w:spacing w:after="120" w:before="0" w:line="360" w:lineRule="auto"/>
+        <w:jc w:val="both"/>
+      </w:pPr>
+      <w:r>
+        <w:rPr>
+          <w:rFonts w:ascii="Times New Roman" w:hAnsi="Times New Roman" w:eastAsia="Times New Roman"/>
+          <w:b w:val="0"/>
+          <w:i w:val="0"/>
+          <w:sz w:val="24"/>
+        </w:rPr>
+        <w:t>Why it works: feeding the model the real figures and capping the length forces prioritisation instead of generic commentary. Expected output: a tight, plain-language summary of the month with one clear priority called out.</w:t>
       </w:r>
     </w:p>
     <w:p>
@@ -1865,9 +2085,19 @@
     </w:p>
     <w:p>
       <w:pPr>
-        <w:spacing w:after="120" w:before="0" w:line="360" w:lineRule="auto"/>
+        <w:spacing w:after="40" w:line="360" w:lineRule="auto"/>
+        <w:ind w:left="720" w:hanging="432"/>
         <w:jc w:val="both"/>
       </w:pPr>
+      <w:r>
+        <w:rPr>
+          <w:rFonts w:ascii="Times New Roman" w:hAnsi="Times New Roman" w:eastAsia="Times New Roman"/>
+          <w:b/>
+          <w:i w:val="0"/>
+          <w:sz w:val="24"/>
+        </w:rPr>
+        <w:t xml:space="preserve">Role: </w:t>
+      </w:r>
       <w:r>
         <w:rPr>
           <w:rFonts w:ascii="Times New Roman" w:hAnsi="Times New Roman" w:eastAsia="Times New Roman"/>
@@ -1875,14 +2105,24 @@
           <w:i w:val="0"/>
           <w:sz w:val="24"/>
         </w:rPr>
-        <w:t>Prompt: "You are a telecom strategy consultant. Based on the finding that network faults in the North region rose 40% before a spike in complaints, suggest three testable hypotheses for the cause and the data needed to check each one."</w:t>
+        <w:t>A telecom strategy consultant.</w:t>
       </w:r>
     </w:p>
     <w:p>
       <w:pPr>
-        <w:spacing w:after="120" w:before="0" w:line="360" w:lineRule="auto"/>
+        <w:spacing w:after="40" w:line="360" w:lineRule="auto"/>
+        <w:ind w:left="720" w:hanging="432"/>
         <w:jc w:val="both"/>
       </w:pPr>
+      <w:r>
+        <w:rPr>
+          <w:rFonts w:ascii="Times New Roman" w:hAnsi="Times New Roman" w:eastAsia="Times New Roman"/>
+          <w:b/>
+          <w:i w:val="0"/>
+          <w:sz w:val="24"/>
+        </w:rPr>
+        <w:t xml:space="preserve">Task: </w:t>
+      </w:r>
       <w:r>
         <w:rPr>
           <w:rFonts w:ascii="Times New Roman" w:hAnsi="Times New Roman" w:eastAsia="Times New Roman"/>
@@ -1890,7 +2130,97 @@
           <w:i w:val="0"/>
           <w:sz w:val="24"/>
         </w:rPr>
-        <w:t>Objective: to move from a pattern to something the team can act on. It works by giving the model a concrete finding and asking for hypotheses plus the evidence to test them, which keeps it grounded. Expected output: three plausible causes, each paired with the data that would confirm or rule it out. A sample response is shown in Appendix A.</w:t>
+        <w:t>Propose testable causes for a spike in network faults.</w:t>
+      </w:r>
+    </w:p>
+    <w:p>
+      <w:pPr>
+        <w:spacing w:after="40" w:line="360" w:lineRule="auto"/>
+        <w:ind w:left="720" w:hanging="432"/>
+        <w:jc w:val="both"/>
+      </w:pPr>
+      <w:r>
+        <w:rPr>
+          <w:rFonts w:ascii="Times New Roman" w:hAnsi="Times New Roman" w:eastAsia="Times New Roman"/>
+          <w:b/>
+          <w:i w:val="0"/>
+          <w:sz w:val="24"/>
+        </w:rPr>
+        <w:t xml:space="preserve">Context: </w:t>
+      </w:r>
+      <w:r>
+        <w:rPr>
+          <w:rFonts w:ascii="Times New Roman" w:hAnsi="Times New Roman" w:eastAsia="Times New Roman"/>
+          <w:b w:val="0"/>
+          <w:i w:val="0"/>
+          <w:sz w:val="24"/>
+        </w:rPr>
+        <w:t>Faults in the North region rose 40% in the week before a surge in customer complaints.</w:t>
+      </w:r>
+    </w:p>
+    <w:p>
+      <w:pPr>
+        <w:spacing w:after="40" w:line="360" w:lineRule="auto"/>
+        <w:ind w:left="720" w:hanging="432"/>
+        <w:jc w:val="both"/>
+      </w:pPr>
+      <w:r>
+        <w:rPr>
+          <w:rFonts w:ascii="Times New Roman" w:hAnsi="Times New Roman" w:eastAsia="Times New Roman"/>
+          <w:b/>
+          <w:i w:val="0"/>
+          <w:sz w:val="24"/>
+        </w:rPr>
+        <w:t xml:space="preserve">Constraints: </w:t>
+      </w:r>
+      <w:r>
+        <w:rPr>
+          <w:rFonts w:ascii="Times New Roman" w:hAnsi="Times New Roman" w:eastAsia="Times New Roman"/>
+          <w:b w:val="0"/>
+          <w:i w:val="0"/>
+          <w:sz w:val="24"/>
+        </w:rPr>
+        <w:t>Give exactly three hypotheses, and pair each with the data needed to test it.</w:t>
+      </w:r>
+    </w:p>
+    <w:p>
+      <w:pPr>
+        <w:spacing w:after="40" w:line="360" w:lineRule="auto"/>
+        <w:ind w:left="720" w:hanging="432"/>
+        <w:jc w:val="both"/>
+      </w:pPr>
+      <w:r>
+        <w:rPr>
+          <w:rFonts w:ascii="Times New Roman" w:hAnsi="Times New Roman" w:eastAsia="Times New Roman"/>
+          <w:b/>
+          <w:i w:val="0"/>
+          <w:sz w:val="24"/>
+        </w:rPr>
+        <w:t xml:space="preserve">Output Format: </w:t>
+      </w:r>
+      <w:r>
+        <w:rPr>
+          <w:rFonts w:ascii="Times New Roman" w:hAnsi="Times New Roman" w:eastAsia="Times New Roman"/>
+          <w:b w:val="0"/>
+          <w:i w:val="0"/>
+          <w:sz w:val="24"/>
+        </w:rPr>
+        <w:t>Three hypotheses, each with its verifying data source.</w:t>
+      </w:r>
+    </w:p>
+    <w:p>
+      <w:pPr>
+        <w:spacing w:after="120" w:before="0" w:line="360" w:lineRule="auto"/>
+        <w:jc w:val="both"/>
+      </w:pPr>
+      <w:r>
+        <w:rPr>
+          <w:rFonts w:ascii="Times New Roman" w:hAnsi="Times New Roman" w:eastAsia="Times New Roman"/>
+          <w:b w:val="0"/>
+          <w:i w:val="0"/>
+          <w:sz w:val="24"/>
+        </w:rPr>
+        <w:t>Why it works: anchoring on a concrete finding and demanding testable hypotheses keeps the model grounded and moves it from pattern to action. Expected output: three plausible causes, each paired with the evidence that would confirm or rule it out. A sample response is shown in Appendix A.</w:t>
       </w:r>
     </w:p>
     <w:p>
@@ -1911,9 +2241,19 @@
     </w:p>
     <w:p>
       <w:pPr>
-        <w:spacing w:after="120" w:before="0" w:line="360" w:lineRule="auto"/>
+        <w:spacing w:after="40" w:line="360" w:lineRule="auto"/>
+        <w:ind w:left="720" w:hanging="432"/>
         <w:jc w:val="both"/>
       </w:pPr>
+      <w:r>
+        <w:rPr>
+          <w:rFonts w:ascii="Times New Roman" w:hAnsi="Times New Roman" w:eastAsia="Times New Roman"/>
+          <w:b/>
+          <w:i w:val="0"/>
+          <w:sz w:val="24"/>
+        </w:rPr>
+        <w:t xml:space="preserve">Role: </w:t>
+      </w:r>
       <w:r>
         <w:rPr>
           <w:rFonts w:ascii="Times New Roman" w:hAnsi="Times New Roman" w:eastAsia="Times New Roman"/>
@@ -1921,14 +2261,24 @@
           <w:i w:val="0"/>
           <w:sz w:val="24"/>
         </w:rPr>
-        <w:t>Prompt: "As an advisor to MTN's executive committee, weigh the trade-offs of investing $50m in network upgrades in one high-churn market versus spreading it across three. Consider churn, ARPU, and coverage, and recommend an option with your reasoning."</w:t>
+        <w:t>An advisor to MTN's executive committee.</w:t>
       </w:r>
     </w:p>
     <w:p>
       <w:pPr>
-        <w:spacing w:after="120" w:before="0" w:line="360" w:lineRule="auto"/>
+        <w:spacing w:after="40" w:line="360" w:lineRule="auto"/>
+        <w:ind w:left="720" w:hanging="432"/>
         <w:jc w:val="both"/>
       </w:pPr>
+      <w:r>
+        <w:rPr>
+          <w:rFonts w:ascii="Times New Roman" w:hAnsi="Times New Roman" w:eastAsia="Times New Roman"/>
+          <w:b/>
+          <w:i w:val="0"/>
+          <w:sz w:val="24"/>
+        </w:rPr>
+        <w:t xml:space="preserve">Task: </w:t>
+      </w:r>
       <w:r>
         <w:rPr>
           <w:rFonts w:ascii="Times New Roman" w:hAnsi="Times New Roman" w:eastAsia="Times New Roman"/>
@@ -1936,7 +2286,97 @@
           <w:i w:val="0"/>
           <w:sz w:val="24"/>
         </w:rPr>
-        <w:t>Objective: to support a genuine capital-allocation choice. It is effective because it frames a real decision with named constraints and demands a recommendation, not a summary. Expected output: a reasoned comparison of the two options ending in a clear, defensible recommendation the committee can debate.</w:t>
+        <w:t>Weigh a $50m network-investment choice and recommend an option.</w:t>
+      </w:r>
+    </w:p>
+    <w:p>
+      <w:pPr>
+        <w:spacing w:after="40" w:line="360" w:lineRule="auto"/>
+        <w:ind w:left="720" w:hanging="432"/>
+        <w:jc w:val="both"/>
+      </w:pPr>
+      <w:r>
+        <w:rPr>
+          <w:rFonts w:ascii="Times New Roman" w:hAnsi="Times New Roman" w:eastAsia="Times New Roman"/>
+          <w:b/>
+          <w:i w:val="0"/>
+          <w:sz w:val="24"/>
+        </w:rPr>
+        <w:t xml:space="preserve">Context: </w:t>
+      </w:r>
+      <w:r>
+        <w:rPr>
+          <w:rFonts w:ascii="Times New Roman" w:hAnsi="Times New Roman" w:eastAsia="Times New Roman"/>
+          <w:b w:val="0"/>
+          <w:i w:val="0"/>
+          <w:sz w:val="24"/>
+        </w:rPr>
+        <w:t>The choice is between concentrating the spend in one high-churn market or spreading it across three.</w:t>
+      </w:r>
+    </w:p>
+    <w:p>
+      <w:pPr>
+        <w:spacing w:after="40" w:line="360" w:lineRule="auto"/>
+        <w:ind w:left="720" w:hanging="432"/>
+        <w:jc w:val="both"/>
+      </w:pPr>
+      <w:r>
+        <w:rPr>
+          <w:rFonts w:ascii="Times New Roman" w:hAnsi="Times New Roman" w:eastAsia="Times New Roman"/>
+          <w:b/>
+          <w:i w:val="0"/>
+          <w:sz w:val="24"/>
+        </w:rPr>
+        <w:t xml:space="preserve">Constraints: </w:t>
+      </w:r>
+      <w:r>
+        <w:rPr>
+          <w:rFonts w:ascii="Times New Roman" w:hAnsi="Times New Roman" w:eastAsia="Times New Roman"/>
+          <w:b w:val="0"/>
+          <w:i w:val="0"/>
+          <w:sz w:val="24"/>
+        </w:rPr>
+        <w:t>Consider churn, ARPU, and coverage, and end with a single recommendation and its reasoning.</w:t>
+      </w:r>
+    </w:p>
+    <w:p>
+      <w:pPr>
+        <w:spacing w:after="40" w:line="360" w:lineRule="auto"/>
+        <w:ind w:left="720" w:hanging="432"/>
+        <w:jc w:val="both"/>
+      </w:pPr>
+      <w:r>
+        <w:rPr>
+          <w:rFonts w:ascii="Times New Roman" w:hAnsi="Times New Roman" w:eastAsia="Times New Roman"/>
+          <w:b/>
+          <w:i w:val="0"/>
+          <w:sz w:val="24"/>
+        </w:rPr>
+        <w:t xml:space="preserve">Output Format: </w:t>
+      </w:r>
+      <w:r>
+        <w:rPr>
+          <w:rFonts w:ascii="Times New Roman" w:hAnsi="Times New Roman" w:eastAsia="Times New Roman"/>
+          <w:b w:val="0"/>
+          <w:i w:val="0"/>
+          <w:sz w:val="24"/>
+        </w:rPr>
+        <w:t>A short comparison of the two options, followed by a clear recommendation.</w:t>
+      </w:r>
+    </w:p>
+    <w:p>
+      <w:pPr>
+        <w:spacing w:after="120" w:before="0" w:line="360" w:lineRule="auto"/>
+        <w:jc w:val="both"/>
+      </w:pPr>
+      <w:r>
+        <w:rPr>
+          <w:rFonts w:ascii="Times New Roman" w:hAnsi="Times New Roman" w:eastAsia="Times New Roman"/>
+          <w:b w:val="0"/>
+          <w:i w:val="0"/>
+          <w:sz w:val="24"/>
+        </w:rPr>
+        <w:t>Why it works: framing a real decision with named constraints and forcing a recommendation yields something the committee can debate, not a bland summary. Expected output: a reasoned two-option comparison ending in a defensible recommendation.</w:t>
       </w:r>
     </w:p>
     <w:p>

</xml_diff>